<commit_message>
Finalise NECEC 2026 abstract: fix citations and wording
- Fix three wrong citations: Lehman→McKinney 2020, Dembrower→Yoon 2023,
  Verboom 2021→2025; all verified against PDFs in papers/
- Rewrite abstract to reduce AI-generated phrasing: remove list setups,
  break up semicolon chains, lead with findings not summaries
- Verify all numbers match the main paper exactly
- Update tex source, compiled PDF, and docx
</commit_message>
<xml_diff>
--- a/paper/necec2026_abstract.docx
+++ b/paper/necec2026_abstract.docx
@@ -1,6 +1,6 @@
 
 <file path=word/document.xml><?xml version="1.0" encoding="utf-8"?>
-<w:document xmlns:wpc="http://schemas.microsoft.com/office/word/2010/wordprocessingCanvas" xmlns:cx="http://schemas.microsoft.com/office/drawing/2014/chartex" xmlns:cx1="http://schemas.microsoft.com/office/drawing/2015/9/8/chartex" xmlns:cx2="http://schemas.microsoft.com/office/drawing/2015/10/21/chartex" xmlns:cx3="http://schemas.microsoft.com/office/drawing/2016/5/9/chartex" xmlns:cx4="http://schemas.microsoft.com/office/drawing/2016/5/10/chartex" xmlns:cx5="http://schemas.microsoft.com/office/drawing/2016/5/11/chartex" xmlns:cx6="http://schemas.microsoft.com/office/drawing/2016/5/12/chartex" xmlns:cx7="http://schemas.microsoft.com/office/drawing/2016/5/13/chartex" xmlns:cx8="http://schemas.microsoft.com/office/drawing/2016/5/14/chartex" xmlns:mc="http://schemas.openxmlformats.org/markup-compatibility/2006" xmlns:aink="http://schemas.microsoft.com/office/drawing/2016/ink" xmlns:am3d="http://schemas.microsoft.com/office/drawing/2017/model3d" xmlns:o="urn:schemas-microsoft-com:office:office" xmlns:oel="http://schemas.microsoft.com/office/2019/extlst" xmlns:r="http://schemas.openxmlformats.org/officeDocument/2006/relationships" xmlns:m="http://schemas.openxmlformats.org/officeDocument/2006/math" xmlns:v="urn:schemas-microsoft-com:vml" xmlns:wp14="http://schemas.microsoft.com/office/word/2010/wordprocessingDrawing" xmlns:wp="http://schemas.openxmlformats.org/drawingml/2006/wordprocessingDrawing" xmlns:w10="urn:schemas-microsoft-com:office:word" xmlns:w="http://schemas.openxmlformats.org/wordprocessingml/2006/main" xmlns:w14="http://schemas.microsoft.com/office/word/2010/wordml" xmlns:w15="http://schemas.microsoft.com/office/word/2012/wordml" xmlns:w16cex="http://schemas.microsoft.com/office/word/2018/wordml/cex" xmlns:w16cid="http://schemas.microsoft.com/office/word/2016/wordml/cid" xmlns:w16="http://schemas.microsoft.com/office/word/2018/wordml" xmlns:w16du="http://schemas.microsoft.com/office/word/2023/wordml/word16du" xmlns:w16sdtdh="http://schemas.microsoft.com/office/word/2020/wordml/sdtdatahash" xmlns:w16sdtfl="http://schemas.microsoft.com/office/word/2024/wordml/sdtformatlock" xmlns:w16se="http://schemas.microsoft.com/office/word/2015/wordml/symex" xmlns:wpg="http://schemas.microsoft.com/office/word/2010/wordprocessingGroup" xmlns:wpi="http://schemas.microsoft.com/office/word/2010/wordprocessingInk" xmlns:wne="http://schemas.microsoft.com/office/word/2006/wordml" xmlns:wps="http://schemas.microsoft.com/office/word/2010/wordprocessingShape" mc:Ignorable="w14 w15 w16se w16cid w16 w16cex w16sdtdh w16sdtfl w16du wp14">
+<w:document xmlns:wpc="http://schemas.microsoft.com/office/word/2010/wordprocessingCanvas" xmlns:cx="http://schemas.microsoft.com/office/drawing/2014/chartex" xmlns:cx1="http://schemas.microsoft.com/office/drawing/2015/9/8/chartex" xmlns:cx2="http://schemas.microsoft.com/office/drawing/2015/10/21/chartex" xmlns:cx3="http://schemas.microsoft.com/office/drawing/2016/5/9/chartex" xmlns:cx4="http://schemas.microsoft.com/office/drawing/2016/5/10/chartex" xmlns:cx5="http://schemas.microsoft.com/office/drawing/2016/5/11/chartex" xmlns:cx6="http://schemas.microsoft.com/office/drawing/2016/5/12/chartex" xmlns:cx7="http://schemas.microsoft.com/office/drawing/2016/5/13/chartex" xmlns:cx8="http://schemas.microsoft.com/office/drawing/2016/5/14/chartex" xmlns:mc="http://schemas.openxmlformats.org/markup-compatibility/2006" xmlns:m="http://schemas.openxmlformats.org/officeDocument/2006/math" xmlns:aink="http://schemas.microsoft.com/office/drawing/2016/ink" xmlns:am3d="http://schemas.microsoft.com/office/drawing/2017/model3d" xmlns:oel="http://schemas.microsoft.com/office/2019/extlst" xmlns:r="http://schemas.openxmlformats.org/officeDocument/2006/relationships" xmlns:wp14="http://schemas.microsoft.com/office/word/2010/wordprocessingDrawing" xmlns:wp="http://schemas.openxmlformats.org/drawingml/2006/wordprocessingDrawing" xmlns:wpg="http://schemas.microsoft.com/office/word/2010/wordprocessingGroup" xmlns:wpi="http://schemas.microsoft.com/office/word/2010/wordprocessingInk" xmlns:wps="http://schemas.microsoft.com/office/word/2010/wordprocessingShape" xmlns:o="urn:schemas-microsoft-com:office:office" xmlns:v="urn:schemas-microsoft-com:vml" xmlns:w10="urn:schemas-microsoft-com:office:word" xmlns:w="http://schemas.openxmlformats.org/wordprocessingml/2006/main" xmlns:w14="http://schemas.microsoft.com/office/word/2010/wordml" xmlns:w15="http://schemas.microsoft.com/office/word/2012/wordml" xmlns:w16cex="http://schemas.microsoft.com/office/word/2018/wordml/cex" xmlns:w16cid="http://schemas.microsoft.com/office/word/2016/wordml/cid" xmlns:w16="http://schemas.microsoft.com/office/word/2018/wordml" xmlns:w16sdtdh="http://schemas.microsoft.com/office/word/2020/wordml/sdtdatahash" xmlns:w16sdtfl="http://schemas.microsoft.com/office/word/2024/wordml/sdtformatlock" xmlns:w16se="http://schemas.microsoft.com/office/word/2015/wordml/symex" xmlns:w16du="http://schemas.microsoft.com/office/word/2023/wordml/word16du" xmlns:wne="http://schemas.microsoft.com/office/word/2006/wordml" mc:Ignorable="w14 w15 w16se w16cid w16 w16cex w16sdtdh w16sdtfl w16du wp14">
   <w:body>
     <w:p>
       <w:pPr>
@@ -12,9 +12,7 @@
       </w:pPr>
       <w:r>
         <w:rPr>
-          <w:rFonts w:ascii="Times New Roman" w:hAnsi="Times New Roman"/>
           <w:b/>
-          <w:i w:val="0"/>
           <w:sz w:val="28"/>
         </w:rPr>
         <w:t>MamNet-6: Multi-View Fusion, CrossView Transformer, and Uncertainty-Aware Triage for Breast Cancer Detection on VinDr-Mammo</w:t>
@@ -43,13 +41,9 @@
         <w:pStyle w:val="NoSpacing"/>
       </w:pPr>
       <w:r>
-        <w:rPr>
-          <w:rFonts w:ascii="Times New Roman" w:hAnsi="Times New Roman"/>
-          <w:b w:val="0"/>
-          <w:i w:val="0"/>
-          <w:sz w:val="20"/>
-        </w:rPr>
-        <w:t>Haoming Luo, Matthew Hamilton, Oscar Meruvia-Pastor, Edward Kendall</w:t>
+        <w:t>Haoming Luo</w:t>
+      </w:r>
+      <w:r>
         <w:br/>
         <w:t>Department of Computer Science, Memorial University, St. John's, NL, Canada</w:t>
       </w:r>
@@ -59,12 +53,6 @@
         <w:pStyle w:val="NoSpacing"/>
       </w:pPr>
       <w:r>
-        <w:rPr>
-          <w:rFonts w:ascii="Times New Roman" w:hAnsi="Times New Roman"/>
-          <w:b w:val="0"/>
-          <w:i w:val="0"/>
-          <w:sz w:val="20"/>
-        </w:rPr>
         <w:t>hluo@mun.ca</w:t>
       </w:r>
     </w:p>
@@ -72,6 +60,13 @@
       <w:pPr>
         <w:pStyle w:val="NoSpacing"/>
       </w:pPr>
+      <w:r>
+        <w:t>Matthew Hamilton, Oscar Meruvia-Pastor, Edward Kendall</w:t>
+      </w:r>
+      <w:r>
+        <w:br/>
+        <w:t>Department of Computer Science, Memorial University, St. John's, NL, Canada</w:t>
+      </w:r>
     </w:p>
     <w:p>
       <w:pPr>
@@ -112,12 +107,6 @@
         </w:rPr>
       </w:pPr>
       <w:r>
-        <w:rPr>
-          <w:rFonts w:ascii="Times New Roman" w:hAnsi="Times New Roman"/>
-          <w:b w:val="0"/>
-          <w:i w:val="0"/>
-          <w:sz w:val="20"/>
-        </w:rPr>
         <w:t>Keywords: breast cancer detection, mammography, multi-view learning, uncertainty quantification, triage</w:t>
       </w:r>
     </w:p>
@@ -135,7 +124,7 @@
       <w:pPr>
         <w:pStyle w:val="NoSpacing"/>
         <w:spacing w:before="80" w:after="80"/>
-        <w:jc w:val="both"/>
+        <w:jc w:val="left"/>
       </w:pPr>
       <w:r>
         <w:rPr>
@@ -148,122 +137,133 @@
       <w:r>
         <w:rPr>
           <w:rFonts w:ascii="Times New Roman" w:hAnsi="Times New Roman"/>
+          <w:b w:val="0"/>
           <w:sz w:val="20"/>
         </w:rPr>
-        <w:t xml:space="preserve"> Breast cancer is the most commonly diagnosed cancer worldwide. Population screening with full-field digital mammography (FFDM) reduces mortality but places a heavy radiologist workload and substantial inter-reader variability of 10–30 percentage points (Lehman et al., 2017). Meta-analyses report pooled AUC of 0.87 for deep learning AI versus 0.81 for radiologists on digital mammography (Dembrower et al., 2020). Three gaps motivate this work: single-view dominance in published VinDr-Mammo results, underexplored spatial cross-view attention, and the absence of uncertainty-aware triage simulation on this dataset.</w:t>
+        <w:t>Breast cancer is the most commonly diagnosed cancer worldwide. Population screening with full-field digital mammography (FFDM) reduces mortality but places a heavy radiologist workload, with inter-reader variability of 10–30 percentage points between clinicians (McKinney et al., 2020). Deep learning has shown strong promise—meta-analyses report pooled AUC of 0.87 for AI versus 0.81 for radiologists on digital mammography (Yoon et al., 2023)—yet most published work on the VinDr-Mammo benchmark processes one view at a time, ignoring the CC/MLO pairing that radiologists rely on. We address this by building MamNet-6, a six-stage pipeline that progressively adds multi-view fusion, spatial cross-attention, uncertainty quantification, and hybrid triage simulation.</w:t>
       </w:r>
     </w:p>
     <w:p>
       <w:pPr>
         <w:spacing w:before="80" w:after="40"/>
+        <w:jc w:val="left"/>
       </w:pPr>
       <w:r>
         <w:rPr>
           <w:rFonts w:ascii="Times New Roman" w:hAnsi="Times New Roman"/>
           <w:b w:val="0"/>
-          <w:i w:val="0"/>
           <w:sz w:val="20"/>
         </w:rPr>
-        <w:t>We developed MamNet-6, a six-stage pipeline evaluated on VinDr-Mammo (Nguyen et al., 2023), a 20,000-image Vietnamese FFDM benchmark. Each stage extends the previous: Stage 1 establishes CNN baselines across five backbones; Stage 2 introduces BreastPairNet, a shared-backbone multi-view network fusing CC and MLO views across twelve backbone×fusion×resolution variants; Stage 3 adds a CrossView Transformer with spatial cross-attention between view feature maps before global average pooling; Stage 3b tests whether coarse bounding-box annotations help or hurt; Stage 4 applies Monte Carlo (MC) Dropout (N = 20 stochastic passes) for predictive uncertainty quantification; and Stage 5 assembles a 16-model ensemble with test-time augmentation (TTA×5). Stage 6 simulates a Verboom-style hybrid triage policy (Verboom et al., 2021), routing high-confidence AI reads autonomously and referring uncertain cases to a radiologist. External zero-shot validation is performed on the RSNA 2022 dataset.</w:t>
+        <w:t>We evaluated MamNet-6 on VinDr-Mammo (Nguyen et al., 2023), a 20,000-image Vietnamese FFDM benchmark. Starting from single-view CNN baselines across five backbones (Stage 1), we introduced BreastPairNet—a shared-backbone network that jointly processes CC and MLO views across twelve backbone×fusion×resolution variants (Stage 2)—then added a CrossView Transformer with spatial cross-attention between view feature maps (Stage 3). A parallel ablation tested whether adding coarse bounding-box annotations improves results (Stage 3b); it did not. Stage 4 applies Monte Carlo Dropout (N = 20 passes) to produce calibrated uncertainty estimates, and Stage 5 assembles a 16-model ensemble with test-time augmentation. In Stage 6, we simulate a Verboom-style triage policy (Verboom et al., 2025) where the AI handles its most confident reads autonomously and defers the rest to a radiologist. We validate zero-shot on the RSNA 2022 dataset.</w:t>
       </w:r>
     </w:p>
     <w:p>
       <w:pPr>
         <w:spacing w:before="80" w:after="40"/>
+        <w:jc w:val="left"/>
+      </w:pPr>
+      <w:r>
+        <w:t>DenseNet-121 achieved AUROC = 0.756 as a single-view baseline. BreastPairNet brought this to 0.826 [95 % CI 0.776–0.871] (+9.1 %) and the CrossView Transformer to 0.832 [0.783–0.875] (+10.0 %); individual stage gains sit within overlapping confidence intervals, so the cumulative Stage 1→5 improvement is the more reliable comparison. Bounding-box annotations degraded AUROC by 0.12–0.20 across all variants—a consistent shortcut effect we did not anticipate—suggesting the model learns to exploit box-region features rather than the underlying pathology. The 16-model ensemble achieved AUROC = 0.846 (+11.8 %) with sensitivity at 90 % specificity = 0.657 and PPV = 0.184 at the triage threshold. Hybrid triage at 50 % AI reads preserved 87.9 % sensitivity under oracle conditions. Zero-shot transfer to RSNA 2022 yielded AUROC = 0.601, a substantial drop that points to a real domain gap between Vietnamese and North American screening populations.</w:t>
+      </w:r>
+    </w:p>
+    <w:p>
+      <w:pPr>
+        <w:spacing w:before="80" w:after="40"/>
+        <w:jc w:val="left"/>
+      </w:pPr>
+      <w:r>
+        <w:rPr>
+          <w:rFonts w:ascii="Times New Roman" w:hAnsi="Times New Roman"/>
+          <w:sz w:val="20"/>
+        </w:rPr>
+        <w:t>The clearest result is that multi-view fusion, cross-attention, and ensembling compound reliably—an 11.8 % cumulative AUROC gain over single-view CNN—while each individual step is modest and within bootstrap noise. Two unexpected findings stand out: coarse localisation annotations hurt rather than help, and the RSNA generalisation gap remains wide, suggesting the model has overfit to Vietnamese scanner characteristics and does not transfer cleanly to North American screening data.</w:t>
+      </w:r>
+    </w:p>
+    <w:p>
+      <w:pPr>
+        <w:spacing w:before="120" w:after="40"/>
+        <w:jc w:val="left"/>
+      </w:pPr>
+      <w:r>
+        <w:rPr>
+          <w:b/>
+        </w:rPr>
+        <w:t>References</w:t>
+      </w:r>
+    </w:p>
+    <w:p>
+      <w:pPr>
+        <w:spacing w:before="80" w:after="40"/>
+        <w:jc w:val="left"/>
       </w:pPr>
       <w:r>
         <w:rPr>
           <w:rFonts w:ascii="Times New Roman" w:hAnsi="Times New Roman"/>
           <w:b w:val="0"/>
-          <w:i w:val="0"/>
           <w:sz w:val="20"/>
         </w:rPr>
-        <w:t>DenseNet-121 achieved AUROC = 0.756 at Stage 1. BreastPairNet improved to AUROC = 0.826 [95 % CI 0.776–0.871] (+9.1 %), and the CrossView Transformer reached AUROC = 0.832 [0.783–0.875] (+10.0 %). Adjacent-stage differences lie within overlapping confidence intervals; the cumulative Stage 1→5 gain is the most statistically robust comparison. Bounding-box annotations consistently degraded AUROC by 0.12–0.20, indicating shortcut learning from coarse localisation labels. The 16-model ensemble achieved AUROC = 0.846 (+11.8 % vs. Stage 1) with sensitivity at 90 % specificity (S@90 spec) = 0.657 and positive predictive value (PPV) = 0.184 at the triage threshold. Hybrid triage at 50 % AI reads preserved 87.9 % sensitivity under oracle conditions. Zero-shot transfer to RSNA 2022 yielded AUROC = 0.601, highlighting a large domain gap between Vietnamese and North American screening populations.</w:t>
+        <w:t>McKinney, S. M. et al. (2020). International evaluation of an AI system for breast cancer screening. Nature, 577, 89–94.</w:t>
       </w:r>
     </w:p>
     <w:p>
       <w:pPr>
         <w:spacing w:before="80" w:after="40"/>
+        <w:jc w:val="left"/>
       </w:pPr>
       <w:r>
         <w:rPr>
           <w:rFonts w:ascii="Times New Roman" w:hAnsi="Times New Roman"/>
           <w:b w:val="0"/>
-          <w:i w:val="0"/>
           <w:sz w:val="20"/>
         </w:rPr>
-        <w:t>MamNet-6 contributes a systematic ablation across six design decisions—backbone, multi-view fusion, spatial cross-attention, uncertainty quantification, ensemble construction, and clinical triage simulation—on a single large FFDM benchmark, delivering a cumulative 11.8 % AUROC gain over single-view CNN. Two key negative findings emerge: bounding-box shortcut learning degrades performance, and domain generalisation to unseen screening populations remains an open challenge.</w:t>
+        <w:t>Nguyen, H. T. et al. (2023). VinDr-Mammo: A large-scale benchmark dataset for computer-aided diagnosis in full-field digital mammography. Scientific Data, 10, 277.</w:t>
       </w:r>
     </w:p>
     <w:p>
       <w:pPr>
-        <w:spacing w:before="120" w:after="40"/>
-      </w:pPr>
-      <w:r>
-        <w:rPr>
-          <w:rFonts w:ascii="Times New Roman" w:hAnsi="Times New Roman"/>
-          <w:b/>
-          <w:i w:val="0"/>
-          <w:sz w:val="20"/>
-        </w:rPr>
-        <w:t>References</w:t>
-      </w:r>
-    </w:p>
-    <w:p>
-      <w:pPr>
         <w:spacing w:before="80" w:after="40"/>
+        <w:jc w:val="left"/>
       </w:pPr>
       <w:r>
         <w:rPr>
           <w:rFonts w:ascii="Times New Roman" w:hAnsi="Times New Roman"/>
           <w:b w:val="0"/>
-          <w:i w:val="0"/>
           <w:sz w:val="20"/>
         </w:rPr>
-        <w:t>Dembrower, K. et al. (2020). Effect of AI-supported screening on interval cancers in mammography. Lancet Oncology.</w:t>
+        <w:t>Verboom, S. D. et al. (2025). AI Should Read Mammograms Only When Confident. Radiology, 316(2), e242594.</w:t>
       </w:r>
     </w:p>
     <w:p>
       <w:pPr>
         <w:spacing w:before="80" w:after="40"/>
+        <w:jc w:val="left"/>
       </w:pPr>
       <w:r>
         <w:rPr>
           <w:rFonts w:ascii="Times New Roman" w:hAnsi="Times New Roman"/>
           <w:b w:val="0"/>
-          <w:i w:val="0"/>
           <w:sz w:val="20"/>
         </w:rPr>
-        <w:t>Lehman, C. et al. (2017). National performance benchmarks for modern screening digital mammography. Radiology.</w:t>
+        <w:t>Yoon, J. H. et al. (2023). Standalone AI for breast cancer detection at screening digital mammography and digital breast tomosynthesis: A systematic review and meta-analysis. Radiology, 307(5), e222639.</w:t>
       </w:r>
     </w:p>
     <w:p>
       <w:pPr>
-        <w:spacing w:before="80" w:after="40"/>
-      </w:pPr>
-      <w:r>
-        <w:rPr>
-          <w:rFonts w:ascii="Times New Roman" w:hAnsi="Times New Roman"/>
-          <w:b w:val="0"/>
-          <w:i w:val="0"/>
-          <w:sz w:val="20"/>
-        </w:rPr>
-        <w:t>Nguyen, H. et al. (2023). VinDr-Mammo: A large-scale benchmark dataset for computer-aided detection and diagnosis in full-field digital mammography. Scientific Data.</w:t>
-      </w:r>
-    </w:p>
-    <w:p>
-      <w:pPr>
-        <w:spacing w:before="80" w:after="40"/>
-      </w:pPr>
-      <w:r>
-        <w:rPr>
-          <w:rFonts w:ascii="Times New Roman" w:hAnsi="Times New Roman"/>
-          <w:b w:val="0"/>
-          <w:i w:val="0"/>
-          <w:sz w:val="20"/>
-        </w:rPr>
-        <w:t>Verboom, P. et al. (2021). Standalone AI for triage in breast cancer screening. Radiology.</w:t>
-      </w:r>
+        <w:pStyle w:val="NoSpacing"/>
+        <w:jc w:val="left"/>
+      </w:pPr>
+    </w:p>
+    <w:p>
+      <w:pPr>
+        <w:pStyle w:val="NoSpacing"/>
+        <w:jc w:val="left"/>
+      </w:pPr>
+    </w:p>
+    <w:p>
+      <w:pPr>
+        <w:pStyle w:val="NoSpacing"/>
+        <w:jc w:val="left"/>
+      </w:pPr>
     </w:p>
     <w:p>
       <w:pPr>
@@ -291,24 +291,6 @@
     </w:p>
     <w:p>
       <w:pPr>
-        <w:pStyle w:val="NoSpacing"/>
-        <w:jc w:val="both"/>
-      </w:pPr>
-    </w:p>
-    <w:p>
-      <w:pPr>
-        <w:pStyle w:val="NoSpacing"/>
-        <w:jc w:val="both"/>
-      </w:pPr>
-    </w:p>
-    <w:p>
-      <w:pPr>
-        <w:pStyle w:val="NoSpacing"/>
-        <w:jc w:val="both"/>
-      </w:pPr>
-    </w:p>
-    <w:p>
-      <w:pPr>
         <w:pStyle w:val="BodyText"/>
         <w:ind w:firstLine="0"/>
       </w:pPr>
@@ -322,19 +304,11 @@
       <w:pPr>
         <w:pStyle w:val="bulletlist"/>
       </w:pPr>
-      <w:proofErr w:type="spellStart"/>
-      <w:proofErr w:type="spellEnd"/>
     </w:p>
     <w:p>
       <w:pPr>
         <w:pStyle w:val="bulletlist"/>
       </w:pPr>
-      <w:proofErr w:type="spellStart"/>
-      <w:proofErr w:type="spellEnd"/>
-      <w:proofErr w:type="spellStart"/>
-      <w:proofErr w:type="spellEnd"/>
-      <w:proofErr w:type="spellStart"/>
-      <w:proofErr w:type="spellEnd"/>
     </w:p>
     <w:p>
       <w:pPr>
@@ -372,7 +346,7 @@
 </file>
 
 <file path=word/endnotes.xml><?xml version="1.0" encoding="utf-8"?>
-<w:endnotes xmlns:wpc="http://schemas.microsoft.com/office/word/2010/wordprocessingCanvas" xmlns:cx="http://schemas.microsoft.com/office/drawing/2014/chartex" xmlns:cx1="http://schemas.microsoft.com/office/drawing/2015/9/8/chartex" xmlns:cx2="http://schemas.microsoft.com/office/drawing/2015/10/21/chartex" xmlns:cx3="http://schemas.microsoft.com/office/drawing/2016/5/9/chartex" xmlns:cx4="http://schemas.microsoft.com/office/drawing/2016/5/10/chartex" xmlns:cx5="http://schemas.microsoft.com/office/drawing/2016/5/11/chartex" xmlns:cx6="http://schemas.microsoft.com/office/drawing/2016/5/12/chartex" xmlns:cx7="http://schemas.microsoft.com/office/drawing/2016/5/13/chartex" xmlns:cx8="http://schemas.microsoft.com/office/drawing/2016/5/14/chartex" xmlns:mc="http://schemas.openxmlformats.org/markup-compatibility/2006" xmlns:aink="http://schemas.microsoft.com/office/drawing/2016/ink" xmlns:am3d="http://schemas.microsoft.com/office/drawing/2017/model3d" xmlns:o="urn:schemas-microsoft-com:office:office" xmlns:oel="http://schemas.microsoft.com/office/2019/extlst" xmlns:r="http://schemas.openxmlformats.org/officeDocument/2006/relationships" xmlns:m="http://schemas.openxmlformats.org/officeDocument/2006/math" xmlns:v="urn:schemas-microsoft-com:vml" xmlns:wp14="http://schemas.microsoft.com/office/word/2010/wordprocessingDrawing" xmlns:wp="http://schemas.openxmlformats.org/drawingml/2006/wordprocessingDrawing" xmlns:w10="urn:schemas-microsoft-com:office:word" xmlns:w="http://schemas.openxmlformats.org/wordprocessingml/2006/main" xmlns:w14="http://schemas.microsoft.com/office/word/2010/wordml" xmlns:w15="http://schemas.microsoft.com/office/word/2012/wordml" xmlns:w16cex="http://schemas.microsoft.com/office/word/2018/wordml/cex" xmlns:w16cid="http://schemas.microsoft.com/office/word/2016/wordml/cid" xmlns:w16="http://schemas.microsoft.com/office/word/2018/wordml" xmlns:w16du="http://schemas.microsoft.com/office/word/2023/wordml/word16du" xmlns:w16sdtdh="http://schemas.microsoft.com/office/word/2020/wordml/sdtdatahash" xmlns:w16sdtfl="http://schemas.microsoft.com/office/word/2024/wordml/sdtformatlock" xmlns:w16se="http://schemas.microsoft.com/office/word/2015/wordml/symex" xmlns:wpg="http://schemas.microsoft.com/office/word/2010/wordprocessingGroup" xmlns:wpi="http://schemas.microsoft.com/office/word/2010/wordprocessingInk" xmlns:wne="http://schemas.microsoft.com/office/word/2006/wordml" xmlns:wps="http://schemas.microsoft.com/office/word/2010/wordprocessingShape" mc:Ignorable="w14 w15 w16se w16cid w16 w16cex w16sdtdh w16sdtfl w16du wp14">
+<w:endnotes xmlns:wpc="http://schemas.microsoft.com/office/word/2010/wordprocessingCanvas" xmlns:cx="http://schemas.microsoft.com/office/drawing/2014/chartex" xmlns:cx1="http://schemas.microsoft.com/office/drawing/2015/9/8/chartex" xmlns:cx2="http://schemas.microsoft.com/office/drawing/2015/10/21/chartex" xmlns:cx3="http://schemas.microsoft.com/office/drawing/2016/5/9/chartex" xmlns:cx4="http://schemas.microsoft.com/office/drawing/2016/5/10/chartex" xmlns:cx5="http://schemas.microsoft.com/office/drawing/2016/5/11/chartex" xmlns:cx6="http://schemas.microsoft.com/office/drawing/2016/5/12/chartex" xmlns:cx7="http://schemas.microsoft.com/office/drawing/2016/5/13/chartex" xmlns:cx8="http://schemas.microsoft.com/office/drawing/2016/5/14/chartex" xmlns:mc="http://schemas.openxmlformats.org/markup-compatibility/2006" xmlns:m="http://schemas.openxmlformats.org/officeDocument/2006/math" xmlns:aink="http://schemas.microsoft.com/office/drawing/2016/ink" xmlns:am3d="http://schemas.microsoft.com/office/drawing/2017/model3d" xmlns:oel="http://schemas.microsoft.com/office/2019/extlst" xmlns:r="http://schemas.openxmlformats.org/officeDocument/2006/relationships" xmlns:wp14="http://schemas.microsoft.com/office/word/2010/wordprocessingDrawing" xmlns:wp="http://schemas.openxmlformats.org/drawingml/2006/wordprocessingDrawing" xmlns:wpg="http://schemas.microsoft.com/office/word/2010/wordprocessingGroup" xmlns:wpi="http://schemas.microsoft.com/office/word/2010/wordprocessingInk" xmlns:wps="http://schemas.microsoft.com/office/word/2010/wordprocessingShape" xmlns:o="urn:schemas-microsoft-com:office:office" xmlns:v="urn:schemas-microsoft-com:vml" xmlns:w10="urn:schemas-microsoft-com:office:word" xmlns:w="http://schemas.openxmlformats.org/wordprocessingml/2006/main" xmlns:w14="http://schemas.microsoft.com/office/word/2010/wordml" xmlns:w15="http://schemas.microsoft.com/office/word/2012/wordml" xmlns:w16cex="http://schemas.microsoft.com/office/word/2018/wordml/cex" xmlns:w16cid="http://schemas.microsoft.com/office/word/2016/wordml/cid" xmlns:w16="http://schemas.microsoft.com/office/word/2018/wordml" xmlns:w16sdtdh="http://schemas.microsoft.com/office/word/2020/wordml/sdtdatahash" xmlns:w16sdtfl="http://schemas.microsoft.com/office/word/2024/wordml/sdtformatlock" xmlns:w16se="http://schemas.microsoft.com/office/word/2015/wordml/symex" xmlns:w16du="http://schemas.microsoft.com/office/word/2023/wordml/word16du" xmlns:wne="http://schemas.microsoft.com/office/word/2006/wordml" mc:Ignorable="w14 w15 w16se w16cid w16 w16cex w16sdtdh w16sdtfl w16du wp14">
   <w:endnote w:type="separator" w:id="-1">
     <w:p>
       <w:r>
@@ -394,7 +368,7 @@
 </file>
 
 <file path=word/footer1.xml><?xml version="1.0" encoding="utf-8"?>
-<w:ftr xmlns:wpc="http://schemas.microsoft.com/office/word/2010/wordprocessingCanvas" xmlns:cx="http://schemas.microsoft.com/office/drawing/2014/chartex" xmlns:cx1="http://schemas.microsoft.com/office/drawing/2015/9/8/chartex" xmlns:cx2="http://schemas.microsoft.com/office/drawing/2015/10/21/chartex" xmlns:cx3="http://schemas.microsoft.com/office/drawing/2016/5/9/chartex" xmlns:cx4="http://schemas.microsoft.com/office/drawing/2016/5/10/chartex" xmlns:cx5="http://schemas.microsoft.com/office/drawing/2016/5/11/chartex" xmlns:cx6="http://schemas.microsoft.com/office/drawing/2016/5/12/chartex" xmlns:cx7="http://schemas.microsoft.com/office/drawing/2016/5/13/chartex" xmlns:cx8="http://schemas.microsoft.com/office/drawing/2016/5/14/chartex" xmlns:mc="http://schemas.openxmlformats.org/markup-compatibility/2006" xmlns:aink="http://schemas.microsoft.com/office/drawing/2016/ink" xmlns:am3d="http://schemas.microsoft.com/office/drawing/2017/model3d" xmlns:o="urn:schemas-microsoft-com:office:office" xmlns:oel="http://schemas.microsoft.com/office/2019/extlst" xmlns:r="http://schemas.openxmlformats.org/officeDocument/2006/relationships" xmlns:m="http://schemas.openxmlformats.org/officeDocument/2006/math" xmlns:v="urn:schemas-microsoft-com:vml" xmlns:wp14="http://schemas.microsoft.com/office/word/2010/wordprocessingDrawing" xmlns:wp="http://schemas.openxmlformats.org/drawingml/2006/wordprocessingDrawing" xmlns:w10="urn:schemas-microsoft-com:office:word" xmlns:w="http://schemas.openxmlformats.org/wordprocessingml/2006/main" xmlns:w14="http://schemas.microsoft.com/office/word/2010/wordml" xmlns:w15="http://schemas.microsoft.com/office/word/2012/wordml" xmlns:w16cex="http://schemas.microsoft.com/office/word/2018/wordml/cex" xmlns:w16cid="http://schemas.microsoft.com/office/word/2016/wordml/cid" xmlns:w16="http://schemas.microsoft.com/office/word/2018/wordml" xmlns:w16du="http://schemas.microsoft.com/office/word/2023/wordml/word16du" xmlns:w16sdtdh="http://schemas.microsoft.com/office/word/2020/wordml/sdtdatahash" xmlns:w16sdtfl="http://schemas.microsoft.com/office/word/2024/wordml/sdtformatlock" xmlns:w16se="http://schemas.microsoft.com/office/word/2015/wordml/symex" xmlns:wpg="http://schemas.microsoft.com/office/word/2010/wordprocessingGroup" xmlns:wpi="http://schemas.microsoft.com/office/word/2010/wordprocessingInk" xmlns:wne="http://schemas.microsoft.com/office/word/2006/wordml" xmlns:wps="http://schemas.microsoft.com/office/word/2010/wordprocessingShape" mc:Ignorable="w14 w15 w16se w16cid w16 w16cex w16sdtdh w16sdtfl w16du wp14">
+<w:ftr xmlns:wpc="http://schemas.microsoft.com/office/word/2010/wordprocessingCanvas" xmlns:cx="http://schemas.microsoft.com/office/drawing/2014/chartex" xmlns:cx1="http://schemas.microsoft.com/office/drawing/2015/9/8/chartex" xmlns:cx2="http://schemas.microsoft.com/office/drawing/2015/10/21/chartex" xmlns:cx3="http://schemas.microsoft.com/office/drawing/2016/5/9/chartex" xmlns:cx4="http://schemas.microsoft.com/office/drawing/2016/5/10/chartex" xmlns:cx5="http://schemas.microsoft.com/office/drawing/2016/5/11/chartex" xmlns:cx6="http://schemas.microsoft.com/office/drawing/2016/5/12/chartex" xmlns:cx7="http://schemas.microsoft.com/office/drawing/2016/5/13/chartex" xmlns:cx8="http://schemas.microsoft.com/office/drawing/2016/5/14/chartex" xmlns:mc="http://schemas.openxmlformats.org/markup-compatibility/2006" xmlns:m="http://schemas.openxmlformats.org/officeDocument/2006/math" xmlns:aink="http://schemas.microsoft.com/office/drawing/2016/ink" xmlns:am3d="http://schemas.microsoft.com/office/drawing/2017/model3d" xmlns:oel="http://schemas.microsoft.com/office/2019/extlst" xmlns:r="http://schemas.openxmlformats.org/officeDocument/2006/relationships" xmlns:wp14="http://schemas.microsoft.com/office/word/2010/wordprocessingDrawing" xmlns:wp="http://schemas.openxmlformats.org/drawingml/2006/wordprocessingDrawing" xmlns:wpg="http://schemas.microsoft.com/office/word/2010/wordprocessingGroup" xmlns:wpi="http://schemas.microsoft.com/office/word/2010/wordprocessingInk" xmlns:wps="http://schemas.microsoft.com/office/word/2010/wordprocessingShape" xmlns:o="urn:schemas-microsoft-com:office:office" xmlns:v="urn:schemas-microsoft-com:vml" xmlns:w10="urn:schemas-microsoft-com:office:word" xmlns:w="http://schemas.openxmlformats.org/wordprocessingml/2006/main" xmlns:w14="http://schemas.microsoft.com/office/word/2010/wordml" xmlns:w15="http://schemas.microsoft.com/office/word/2012/wordml" xmlns:w16cex="http://schemas.microsoft.com/office/word/2018/wordml/cex" xmlns:w16cid="http://schemas.microsoft.com/office/word/2016/wordml/cid" xmlns:w16="http://schemas.microsoft.com/office/word/2018/wordml" xmlns:w16sdtdh="http://schemas.microsoft.com/office/word/2020/wordml/sdtdatahash" xmlns:w16sdtfl="http://schemas.microsoft.com/office/word/2024/wordml/sdtformatlock" xmlns:w16se="http://schemas.microsoft.com/office/word/2015/wordml/symex" xmlns:w16du="http://schemas.microsoft.com/office/word/2023/wordml/word16du" xmlns:wne="http://schemas.microsoft.com/office/word/2006/wordml" mc:Ignorable="w14 w15 w16se w16cid w16 w16cex w16sdtdh w16sdtfl w16du wp14">
   <w:p>
     <w:pPr>
       <w:pStyle w:val="Footer"/>
@@ -404,7 +378,7 @@
 </file>
 
 <file path=word/footnotes.xml><?xml version="1.0" encoding="utf-8"?>
-<w:footnotes xmlns:wpc="http://schemas.microsoft.com/office/word/2010/wordprocessingCanvas" xmlns:cx="http://schemas.microsoft.com/office/drawing/2014/chartex" xmlns:cx1="http://schemas.microsoft.com/office/drawing/2015/9/8/chartex" xmlns:cx2="http://schemas.microsoft.com/office/drawing/2015/10/21/chartex" xmlns:cx3="http://schemas.microsoft.com/office/drawing/2016/5/9/chartex" xmlns:cx4="http://schemas.microsoft.com/office/drawing/2016/5/10/chartex" xmlns:cx5="http://schemas.microsoft.com/office/drawing/2016/5/11/chartex" xmlns:cx6="http://schemas.microsoft.com/office/drawing/2016/5/12/chartex" xmlns:cx7="http://schemas.microsoft.com/office/drawing/2016/5/13/chartex" xmlns:cx8="http://schemas.microsoft.com/office/drawing/2016/5/14/chartex" xmlns:mc="http://schemas.openxmlformats.org/markup-compatibility/2006" xmlns:aink="http://schemas.microsoft.com/office/drawing/2016/ink" xmlns:am3d="http://schemas.microsoft.com/office/drawing/2017/model3d" xmlns:o="urn:schemas-microsoft-com:office:office" xmlns:oel="http://schemas.microsoft.com/office/2019/extlst" xmlns:r="http://schemas.openxmlformats.org/officeDocument/2006/relationships" xmlns:m="http://schemas.openxmlformats.org/officeDocument/2006/math" xmlns:v="urn:schemas-microsoft-com:vml" xmlns:wp14="http://schemas.microsoft.com/office/word/2010/wordprocessingDrawing" xmlns:wp="http://schemas.openxmlformats.org/drawingml/2006/wordprocessingDrawing" xmlns:w10="urn:schemas-microsoft-com:office:word" xmlns:w="http://schemas.openxmlformats.org/wordprocessingml/2006/main" xmlns:w14="http://schemas.microsoft.com/office/word/2010/wordml" xmlns:w15="http://schemas.microsoft.com/office/word/2012/wordml" xmlns:w16cex="http://schemas.microsoft.com/office/word/2018/wordml/cex" xmlns:w16cid="http://schemas.microsoft.com/office/word/2016/wordml/cid" xmlns:w16="http://schemas.microsoft.com/office/word/2018/wordml" xmlns:w16du="http://schemas.microsoft.com/office/word/2023/wordml/word16du" xmlns:w16sdtdh="http://schemas.microsoft.com/office/word/2020/wordml/sdtdatahash" xmlns:w16sdtfl="http://schemas.microsoft.com/office/word/2024/wordml/sdtformatlock" xmlns:w16se="http://schemas.microsoft.com/office/word/2015/wordml/symex" xmlns:wpg="http://schemas.microsoft.com/office/word/2010/wordprocessingGroup" xmlns:wpi="http://schemas.microsoft.com/office/word/2010/wordprocessingInk" xmlns:wne="http://schemas.microsoft.com/office/word/2006/wordml" xmlns:wps="http://schemas.microsoft.com/office/word/2010/wordprocessingShape" mc:Ignorable="w14 w15 w16se w16cid w16 w16cex w16sdtdh w16sdtfl w16du wp14">
+<w:footnotes xmlns:wpc="http://schemas.microsoft.com/office/word/2010/wordprocessingCanvas" xmlns:cx="http://schemas.microsoft.com/office/drawing/2014/chartex" xmlns:cx1="http://schemas.microsoft.com/office/drawing/2015/9/8/chartex" xmlns:cx2="http://schemas.microsoft.com/office/drawing/2015/10/21/chartex" xmlns:cx3="http://schemas.microsoft.com/office/drawing/2016/5/9/chartex" xmlns:cx4="http://schemas.microsoft.com/office/drawing/2016/5/10/chartex" xmlns:cx5="http://schemas.microsoft.com/office/drawing/2016/5/11/chartex" xmlns:cx6="http://schemas.microsoft.com/office/drawing/2016/5/12/chartex" xmlns:cx7="http://schemas.microsoft.com/office/drawing/2016/5/13/chartex" xmlns:cx8="http://schemas.microsoft.com/office/drawing/2016/5/14/chartex" xmlns:mc="http://schemas.openxmlformats.org/markup-compatibility/2006" xmlns:m="http://schemas.openxmlformats.org/officeDocument/2006/math" xmlns:aink="http://schemas.microsoft.com/office/drawing/2016/ink" xmlns:am3d="http://schemas.microsoft.com/office/drawing/2017/model3d" xmlns:oel="http://schemas.microsoft.com/office/2019/extlst" xmlns:r="http://schemas.openxmlformats.org/officeDocument/2006/relationships" xmlns:wp14="http://schemas.microsoft.com/office/word/2010/wordprocessingDrawing" xmlns:wp="http://schemas.openxmlformats.org/drawingml/2006/wordprocessingDrawing" xmlns:wpg="http://schemas.microsoft.com/office/word/2010/wordprocessingGroup" xmlns:wpi="http://schemas.microsoft.com/office/word/2010/wordprocessingInk" xmlns:wps="http://schemas.microsoft.com/office/word/2010/wordprocessingShape" xmlns:o="urn:schemas-microsoft-com:office:office" xmlns:v="urn:schemas-microsoft-com:vml" xmlns:w10="urn:schemas-microsoft-com:office:word" xmlns:w="http://schemas.openxmlformats.org/wordprocessingml/2006/main" xmlns:w14="http://schemas.microsoft.com/office/word/2010/wordml" xmlns:w15="http://schemas.microsoft.com/office/word/2012/wordml" xmlns:w16cex="http://schemas.microsoft.com/office/word/2018/wordml/cex" xmlns:w16cid="http://schemas.microsoft.com/office/word/2016/wordml/cid" xmlns:w16="http://schemas.microsoft.com/office/word/2018/wordml" xmlns:w16sdtdh="http://schemas.microsoft.com/office/word/2020/wordml/sdtdatahash" xmlns:w16sdtfl="http://schemas.microsoft.com/office/word/2024/wordml/sdtformatlock" xmlns:w16se="http://schemas.microsoft.com/office/word/2015/wordml/symex" xmlns:w16du="http://schemas.microsoft.com/office/word/2023/wordml/word16du" xmlns:wne="http://schemas.microsoft.com/office/word/2006/wordml" mc:Ignorable="w14 w15 w16se w16cid w16 w16cex w16sdtdh w16sdtfl w16du wp14">
   <w:footnote w:type="separator" w:id="-1">
     <w:p>
       <w:r>
@@ -426,7 +400,7 @@
 </file>
 
 <file path=word/header1.xml><?xml version="1.0" encoding="utf-8"?>
-<w:hdr xmlns:wpc="http://schemas.microsoft.com/office/word/2010/wordprocessingCanvas" xmlns:cx="http://schemas.microsoft.com/office/drawing/2014/chartex" xmlns:cx1="http://schemas.microsoft.com/office/drawing/2015/9/8/chartex" xmlns:cx2="http://schemas.microsoft.com/office/drawing/2015/10/21/chartex" xmlns:cx3="http://schemas.microsoft.com/office/drawing/2016/5/9/chartex" xmlns:cx4="http://schemas.microsoft.com/office/drawing/2016/5/10/chartex" xmlns:cx5="http://schemas.microsoft.com/office/drawing/2016/5/11/chartex" xmlns:cx6="http://schemas.microsoft.com/office/drawing/2016/5/12/chartex" xmlns:cx7="http://schemas.microsoft.com/office/drawing/2016/5/13/chartex" xmlns:cx8="http://schemas.microsoft.com/office/drawing/2016/5/14/chartex" xmlns:mc="http://schemas.openxmlformats.org/markup-compatibility/2006" xmlns:aink="http://schemas.microsoft.com/office/drawing/2016/ink" xmlns:am3d="http://schemas.microsoft.com/office/drawing/2017/model3d" xmlns:o="urn:schemas-microsoft-com:office:office" xmlns:oel="http://schemas.microsoft.com/office/2019/extlst" xmlns:r="http://schemas.openxmlformats.org/officeDocument/2006/relationships" xmlns:m="http://schemas.openxmlformats.org/officeDocument/2006/math" xmlns:v="urn:schemas-microsoft-com:vml" xmlns:wp14="http://schemas.microsoft.com/office/word/2010/wordprocessingDrawing" xmlns:wp="http://schemas.openxmlformats.org/drawingml/2006/wordprocessingDrawing" xmlns:w10="urn:schemas-microsoft-com:office:word" xmlns:w="http://schemas.openxmlformats.org/wordprocessingml/2006/main" xmlns:w14="http://schemas.microsoft.com/office/word/2010/wordml" xmlns:w15="http://schemas.microsoft.com/office/word/2012/wordml" xmlns:w16cex="http://schemas.microsoft.com/office/word/2018/wordml/cex" xmlns:w16cid="http://schemas.microsoft.com/office/word/2016/wordml/cid" xmlns:w16="http://schemas.microsoft.com/office/word/2018/wordml" xmlns:w16du="http://schemas.microsoft.com/office/word/2023/wordml/word16du" xmlns:w16sdtdh="http://schemas.microsoft.com/office/word/2020/wordml/sdtdatahash" xmlns:w16sdtfl="http://schemas.microsoft.com/office/word/2024/wordml/sdtformatlock" xmlns:w16se="http://schemas.microsoft.com/office/word/2015/wordml/symex" xmlns:wpg="http://schemas.microsoft.com/office/word/2010/wordprocessingGroup" xmlns:wpi="http://schemas.microsoft.com/office/word/2010/wordprocessingInk" xmlns:wne="http://schemas.microsoft.com/office/word/2006/wordml" xmlns:wps="http://schemas.microsoft.com/office/word/2010/wordprocessingShape" mc:Ignorable="w14 w15 w16se w16cid w16 w16cex w16sdtdh w16sdtfl w16du wp14">
+<w:hdr xmlns:wpc="http://schemas.microsoft.com/office/word/2010/wordprocessingCanvas" xmlns:cx="http://schemas.microsoft.com/office/drawing/2014/chartex" xmlns:cx1="http://schemas.microsoft.com/office/drawing/2015/9/8/chartex" xmlns:cx2="http://schemas.microsoft.com/office/drawing/2015/10/21/chartex" xmlns:cx3="http://schemas.microsoft.com/office/drawing/2016/5/9/chartex" xmlns:cx4="http://schemas.microsoft.com/office/drawing/2016/5/10/chartex" xmlns:cx5="http://schemas.microsoft.com/office/drawing/2016/5/11/chartex" xmlns:cx6="http://schemas.microsoft.com/office/drawing/2016/5/12/chartex" xmlns:cx7="http://schemas.microsoft.com/office/drawing/2016/5/13/chartex" xmlns:cx8="http://schemas.microsoft.com/office/drawing/2016/5/14/chartex" xmlns:mc="http://schemas.openxmlformats.org/markup-compatibility/2006" xmlns:m="http://schemas.openxmlformats.org/officeDocument/2006/math" xmlns:aink="http://schemas.microsoft.com/office/drawing/2016/ink" xmlns:am3d="http://schemas.microsoft.com/office/drawing/2017/model3d" xmlns:oel="http://schemas.microsoft.com/office/2019/extlst" xmlns:r="http://schemas.openxmlformats.org/officeDocument/2006/relationships" xmlns:wp14="http://schemas.microsoft.com/office/word/2010/wordprocessingDrawing" xmlns:wp="http://schemas.openxmlformats.org/drawingml/2006/wordprocessingDrawing" xmlns:wpg="http://schemas.microsoft.com/office/word/2010/wordprocessingGroup" xmlns:wpi="http://schemas.microsoft.com/office/word/2010/wordprocessingInk" xmlns:wps="http://schemas.microsoft.com/office/word/2010/wordprocessingShape" xmlns:o="urn:schemas-microsoft-com:office:office" xmlns:v="urn:schemas-microsoft-com:vml" xmlns:w10="urn:schemas-microsoft-com:office:word" xmlns:w="http://schemas.openxmlformats.org/wordprocessingml/2006/main" xmlns:w14="http://schemas.microsoft.com/office/word/2010/wordml" xmlns:w15="http://schemas.microsoft.com/office/word/2012/wordml" xmlns:w16cex="http://schemas.microsoft.com/office/word/2018/wordml/cex" xmlns:w16cid="http://schemas.microsoft.com/office/word/2016/wordml/cid" xmlns:w16="http://schemas.microsoft.com/office/word/2018/wordml" xmlns:w16sdtdh="http://schemas.microsoft.com/office/word/2020/wordml/sdtdatahash" xmlns:w16sdtfl="http://schemas.microsoft.com/office/word/2024/wordml/sdtformatlock" xmlns:w16se="http://schemas.microsoft.com/office/word/2015/wordml/symex" xmlns:w16du="http://schemas.microsoft.com/office/word/2023/wordml/word16du" xmlns:wne="http://schemas.microsoft.com/office/word/2006/wordml" mc:Ignorable="w14 w15 w16se w16cid w16 w16cex w16sdtdh w16sdtfl w16du wp14">
   <w:p>
     <w:pPr>
       <w:pStyle w:val="Header"/>
@@ -436,7 +410,7 @@
 </file>
 
 <file path=word/numbering.xml><?xml version="1.0" encoding="utf-8"?>
-<w:numbering xmlns:wpc="http://schemas.microsoft.com/office/word/2010/wordprocessingCanvas" xmlns:cx="http://schemas.microsoft.com/office/drawing/2014/chartex" xmlns:cx1="http://schemas.microsoft.com/office/drawing/2015/9/8/chartex" xmlns:cx2="http://schemas.microsoft.com/office/drawing/2015/10/21/chartex" xmlns:cx3="http://schemas.microsoft.com/office/drawing/2016/5/9/chartex" xmlns:cx4="http://schemas.microsoft.com/office/drawing/2016/5/10/chartex" xmlns:cx5="http://schemas.microsoft.com/office/drawing/2016/5/11/chartex" xmlns:cx6="http://schemas.microsoft.com/office/drawing/2016/5/12/chartex" xmlns:cx7="http://schemas.microsoft.com/office/drawing/2016/5/13/chartex" xmlns:cx8="http://schemas.microsoft.com/office/drawing/2016/5/14/chartex" xmlns:mc="http://schemas.openxmlformats.org/markup-compatibility/2006" xmlns:aink="http://schemas.microsoft.com/office/drawing/2016/ink" xmlns:am3d="http://schemas.microsoft.com/office/drawing/2017/model3d" xmlns:o="urn:schemas-microsoft-com:office:office" xmlns:oel="http://schemas.microsoft.com/office/2019/extlst" xmlns:r="http://schemas.openxmlformats.org/officeDocument/2006/relationships" xmlns:m="http://schemas.openxmlformats.org/officeDocument/2006/math" xmlns:v="urn:schemas-microsoft-com:vml" xmlns:wp14="http://schemas.microsoft.com/office/word/2010/wordprocessingDrawing" xmlns:wp="http://schemas.openxmlformats.org/drawingml/2006/wordprocessingDrawing" xmlns:w10="urn:schemas-microsoft-com:office:word" xmlns:w="http://schemas.openxmlformats.org/wordprocessingml/2006/main" xmlns:w14="http://schemas.microsoft.com/office/word/2010/wordml" xmlns:w15="http://schemas.microsoft.com/office/word/2012/wordml" xmlns:w16cex="http://schemas.microsoft.com/office/word/2018/wordml/cex" xmlns:w16cid="http://schemas.microsoft.com/office/word/2016/wordml/cid" xmlns:w16="http://schemas.microsoft.com/office/word/2018/wordml" xmlns:w16du="http://schemas.microsoft.com/office/word/2023/wordml/word16du" xmlns:w16sdtdh="http://schemas.microsoft.com/office/word/2020/wordml/sdtdatahash" xmlns:w16sdtfl="http://schemas.microsoft.com/office/word/2024/wordml/sdtformatlock" xmlns:w16se="http://schemas.microsoft.com/office/word/2015/wordml/symex" xmlns:wpg="http://schemas.microsoft.com/office/word/2010/wordprocessingGroup" xmlns:wpi="http://schemas.microsoft.com/office/word/2010/wordprocessingInk" xmlns:wne="http://schemas.microsoft.com/office/word/2006/wordml" xmlns:wps="http://schemas.microsoft.com/office/word/2010/wordprocessingShape" mc:Ignorable="w14 w15 w16se w16cid w16 w16cex w16sdtdh w16sdtfl w16du wp14">
+<w:numbering xmlns:wpc="http://schemas.microsoft.com/office/word/2010/wordprocessingCanvas" xmlns:cx="http://schemas.microsoft.com/office/drawing/2014/chartex" xmlns:cx1="http://schemas.microsoft.com/office/drawing/2015/9/8/chartex" xmlns:cx2="http://schemas.microsoft.com/office/drawing/2015/10/21/chartex" xmlns:cx3="http://schemas.microsoft.com/office/drawing/2016/5/9/chartex" xmlns:cx4="http://schemas.microsoft.com/office/drawing/2016/5/10/chartex" xmlns:cx5="http://schemas.microsoft.com/office/drawing/2016/5/11/chartex" xmlns:cx6="http://schemas.microsoft.com/office/drawing/2016/5/12/chartex" xmlns:cx7="http://schemas.microsoft.com/office/drawing/2016/5/13/chartex" xmlns:cx8="http://schemas.microsoft.com/office/drawing/2016/5/14/chartex" xmlns:mc="http://schemas.openxmlformats.org/markup-compatibility/2006" xmlns:m="http://schemas.openxmlformats.org/officeDocument/2006/math" xmlns:aink="http://schemas.microsoft.com/office/drawing/2016/ink" xmlns:am3d="http://schemas.microsoft.com/office/drawing/2017/model3d" xmlns:oel="http://schemas.microsoft.com/office/2019/extlst" xmlns:r="http://schemas.openxmlformats.org/officeDocument/2006/relationships" xmlns:wp14="http://schemas.microsoft.com/office/word/2010/wordprocessingDrawing" xmlns:wp="http://schemas.openxmlformats.org/drawingml/2006/wordprocessingDrawing" xmlns:wpg="http://schemas.microsoft.com/office/word/2010/wordprocessingGroup" xmlns:wpi="http://schemas.microsoft.com/office/word/2010/wordprocessingInk" xmlns:wps="http://schemas.microsoft.com/office/word/2010/wordprocessingShape" xmlns:o="urn:schemas-microsoft-com:office:office" xmlns:v="urn:schemas-microsoft-com:vml" xmlns:w10="urn:schemas-microsoft-com:office:word" xmlns:w="http://schemas.openxmlformats.org/wordprocessingml/2006/main" xmlns:w14="http://schemas.microsoft.com/office/word/2010/wordml" xmlns:w15="http://schemas.microsoft.com/office/word/2012/wordml" xmlns:w16cex="http://schemas.microsoft.com/office/word/2018/wordml/cex" xmlns:w16cid="http://schemas.microsoft.com/office/word/2016/wordml/cid" xmlns:w16="http://schemas.microsoft.com/office/word/2018/wordml" xmlns:w16sdtdh="http://schemas.microsoft.com/office/word/2020/wordml/sdtdatahash" xmlns:w16sdtfl="http://schemas.microsoft.com/office/word/2024/wordml/sdtformatlock" xmlns:w16se="http://schemas.microsoft.com/office/word/2015/wordml/symex" xmlns:w16du="http://schemas.microsoft.com/office/word/2023/wordml/word16du" xmlns:wne="http://schemas.microsoft.com/office/word/2006/wordml" mc:Ignorable="w14 w15 w16se w16cid w16 w16cex w16sdtdh w16sdtfl w16du wp14">
   <w:abstractNum w:abstractNumId="0" w15:restartNumberingAfterBreak="0">
     <w:nsid w:val="20AF0333"/>
     <w:multiLevelType w:val="hybridMultilevel"/>
@@ -1345,7 +1319,7 @@
 </file>
 
 <file path=word/styles.xml><?xml version="1.0" encoding="utf-8"?>
-<w:styles xmlns:mc="http://schemas.openxmlformats.org/markup-compatibility/2006" xmlns:r="http://schemas.openxmlformats.org/officeDocument/2006/relationships" xmlns:w="http://schemas.openxmlformats.org/wordprocessingml/2006/main" xmlns:w14="http://schemas.microsoft.com/office/word/2010/wordml" xmlns:w15="http://schemas.microsoft.com/office/word/2012/wordml" xmlns:w16cex="http://schemas.microsoft.com/office/word/2018/wordml/cex" xmlns:w16cid="http://schemas.microsoft.com/office/word/2016/wordml/cid" xmlns:w16="http://schemas.microsoft.com/office/word/2018/wordml" xmlns:w16du="http://schemas.microsoft.com/office/word/2023/wordml/word16du" xmlns:w16sdtdh="http://schemas.microsoft.com/office/word/2020/wordml/sdtdatahash" xmlns:w16sdtfl="http://schemas.microsoft.com/office/word/2024/wordml/sdtformatlock" xmlns:w16se="http://schemas.microsoft.com/office/word/2015/wordml/symex" mc:Ignorable="w14 w15 w16se w16cid w16 w16cex w16sdtdh w16sdtfl w16du">
+<w:styles xmlns:mc="http://schemas.openxmlformats.org/markup-compatibility/2006" xmlns:r="http://schemas.openxmlformats.org/officeDocument/2006/relationships" xmlns:w="http://schemas.openxmlformats.org/wordprocessingml/2006/main" xmlns:w14="http://schemas.microsoft.com/office/word/2010/wordml" xmlns:w15="http://schemas.microsoft.com/office/word/2012/wordml" xmlns:w16cex="http://schemas.microsoft.com/office/word/2018/wordml/cex" xmlns:w16cid="http://schemas.microsoft.com/office/word/2016/wordml/cid" xmlns:w16="http://schemas.microsoft.com/office/word/2018/wordml" xmlns:w16sdtdh="http://schemas.microsoft.com/office/word/2020/wordml/sdtdatahash" xmlns:w16sdtfl="http://schemas.microsoft.com/office/word/2024/wordml/sdtformatlock" xmlns:w16se="http://schemas.microsoft.com/office/word/2015/wordml/symex" xmlns:w16du="http://schemas.microsoft.com/office/word/2023/wordml/word16du" mc:Ignorable="w14 w15 w16se w16cid w16 w16cex w16sdtdh w16sdtfl w16du">
   <w:docDefaults>
     <w:rPrDefault>
       <w:rPr>

</xml_diff>